<commit_message>
chore: snapshot current product before graph simplification
</commit_message>
<xml_diff>
--- a/data/demo/sample_package/cover_letter.docx
+++ b/data/demo/sample_package/cover_letter.docx
@@ -8,6 +8,11 @@
         <w:jc w:val="center"/>
       </w:pPr>
       <w:r>
+        <w:rPr>
+          <w:rFonts w:ascii="Times New Roman" w:hAnsi="Times New Roman"/>
+          <w:b/>
+          <w:sz w:val="32"/>
+        </w:rPr>
         <w:t>Demo Candidate</w:t>
       </w:r>
     </w:p>
@@ -17,20 +22,25 @@
         <w:jc w:val="center"/>
       </w:pPr>
       <w:r>
-        <w:t>Fictional Demo contact details omitted</w:t>
-      </w:r>
-    </w:p>
-    <w:p>
-      <w:pPr>
-        <w:spacing w:after="120" w:line="240" w:lineRule="auto"/>
-      </w:pPr>
-      <w:r>
-        <w:rPr>
-          <w:rFonts w:ascii="Times New Roman" w:hAnsi="Times New Roman"/>
-          <w:b w:val="0"/>
-          <w:sz w:val="24"/>
-        </w:rPr>
-        <w:t>July 11, 2026</w:t>
+        <w:rPr>
+          <w:rFonts w:ascii="Times New Roman" w:hAnsi="Times New Roman"/>
+          <w:b w:val="0"/>
+          <w:sz w:val="21"/>
+        </w:rPr>
+        <w:t>candidate@example.com | Example City</w:t>
+      </w:r>
+    </w:p>
+    <w:p>
+      <w:pPr>
+        <w:spacing w:after="120" w:line="240" w:lineRule="auto"/>
+      </w:pPr>
+      <w:r>
+        <w:rPr>
+          <w:rFonts w:ascii="Times New Roman" w:hAnsi="Times New Roman"/>
+          <w:b w:val="0"/>
+          <w:sz w:val="24"/>
+        </w:rPr>
+        <w:t>August 20, 2026</w:t>
       </w:r>
     </w:p>
     <w:p>
@@ -82,46 +92,46 @@
           <w:b w:val="0"/>
           <w:sz w:val="24"/>
         </w:rPr>
-        <w:t>I am interested in the fictional Data Analyst role at Northstar Metrics Studio. My entry-level internship and academic projects include Python and SQL analysis, data visualization, statistics, documentation, and communicating findings to a small project team.</w:t>
-      </w:r>
-    </w:p>
-    <w:p>
-      <w:pPr>
-        <w:spacing w:after="120" w:line="240" w:lineRule="auto"/>
-      </w:pPr>
-      <w:r>
-        <w:rPr>
-          <w:rFonts w:ascii="Times New Roman" w:hAnsi="Times New Roman"/>
-          <w:b w:val="0"/>
-          <w:sz w:val="24"/>
-        </w:rPr>
-        <w:t>In a fictional community research internship, I cleaned tabular datasets, built recurring dashboards, documented quality checks, and presented results to non-technical stakeholders. I also built a classification pipeline with Python and scikit-learn, evaluated it with cross-validation, and created charts explaining the model's performance and limitations.</w:t>
-      </w:r>
-    </w:p>
-    <w:p>
-      <w:pPr>
-        <w:spacing w:after="120" w:line="240" w:lineRule="auto"/>
-      </w:pPr>
-      <w:r>
-        <w:rPr>
-          <w:rFonts w:ascii="Times New Roman" w:hAnsi="Times New Roman"/>
-          <w:b w:val="0"/>
-          <w:sz w:val="24"/>
-        </w:rPr>
-        <w:t>These experiences align with the role's practical analysis and communication requirements. I would bring an evidence-focused approach while continuing to learn from project review and feedback.</w:t>
-      </w:r>
-    </w:p>
-    <w:p>
-      <w:pPr>
-        <w:spacing w:after="120" w:line="240" w:lineRule="auto"/>
-      </w:pPr>
-      <w:r>
-        <w:rPr>
-          <w:rFonts w:ascii="Times New Roman" w:hAnsi="Times New Roman"/>
-          <w:b w:val="0"/>
-          <w:sz w:val="24"/>
-        </w:rPr>
-        <w:t>Thank you for considering this fictional Demo application.</w:t>
+        <w:t>The Data Analyst position at Northstar Metrics Studio centers on Python, with SQL also important to the work. I am interested in the role because these priorities connect to specific projects and experience in my background, including the examples below.</w:t>
+      </w:r>
+    </w:p>
+    <w:p>
+      <w:pPr>
+        <w:spacing w:after="120" w:line="240" w:lineRule="auto"/>
+      </w:pPr>
+      <w:r>
+        <w:rPr>
+          <w:rFonts w:ascii="Times New Roman" w:hAnsi="Times New Roman"/>
+          <w:b w:val="0"/>
+          <w:sz w:val="24"/>
+        </w:rPr>
+        <w:t>In Classification Pipeline, I built a classification pipeline with Python and scikit-learn. This directly supports the position's emphasis on Python. It gives me a concrete basis for contributing to similar work while adapting to the team's tools and operating context.</w:t>
+      </w:r>
+    </w:p>
+    <w:p>
+      <w:pPr>
+        <w:spacing w:after="120" w:line="240" w:lineRule="auto"/>
+      </w:pPr>
+      <w:r>
+        <w:rPr>
+          <w:rFonts w:ascii="Times New Roman" w:hAnsi="Times New Roman"/>
+          <w:b w:val="0"/>
+          <w:sz w:val="24"/>
+        </w:rPr>
+        <w:t>In Public Data Dashboard, I analyzed a fictional public dataset using SQL, Python, and statistics. This evidence aligns directly with the position's need for SQL. It is a second, distinct example of how I have applied relevant skills to concrete work and communicated the result.</w:t>
+      </w:r>
+    </w:p>
+    <w:p>
+      <w:pPr>
+        <w:spacing w:after="120" w:line="240" w:lineRule="auto"/>
+      </w:pPr>
+      <w:r>
+        <w:rPr>
+          <w:rFonts w:ascii="Times New Roman" w:hAnsi="Times New Roman"/>
+          <w:b w:val="0"/>
+          <w:sz w:val="24"/>
+        </w:rPr>
+        <w:t>Together, these examples represent the work in my background that is most relevant to this position. I would welcome the opportunity to discuss how this experience could support the Data Analyst team at Northstar Metrics Studio. Thank you for your time and consideration.</w:t>
       </w:r>
     </w:p>
     <w:p>
@@ -155,6 +165,11 @@
         <w:spacing w:after="0" w:line="240" w:lineRule="auto"/>
       </w:pPr>
       <w:r>
+        <w:rPr>
+          <w:rFonts w:ascii="Times New Roman" w:hAnsi="Times New Roman"/>
+          <w:b w:val="0"/>
+          <w:sz w:val="24"/>
+        </w:rPr>
         <w:t>Demo Candidate</w:t>
       </w:r>
     </w:p>

</xml_diff>